<commit_message>
docs: update project presentation to v1.2 - monthly awards, PIN reset email, kiosk modes, accurate reports
</commit_message>
<xml_diff>
--- a/docs/تقديم-المشروع.docx
+++ b/docs/تقديم-المشروع.docx
@@ -12,7 +12,7 @@
       </w:r>
     </w:p>
     <w:bookmarkEnd w:id="20"/>
-    <w:bookmarkStart w:id="68" w:name="ملف-تقديم-المشروع-إدارة-المدرسة"/>
+    <w:bookmarkStart w:id="69" w:name="ملف-تقديم-المشروع-إدارة-المدرسة"/>
     <w:p>
       <w:pPr>
         <w:pStyle w:val="Heading1"/>
@@ -106,7 +106,7 @@
         <w:t xml:space="preserve"> </w:t>
       </w:r>
       <w:r>
-        <w:t xml:space="preserve">أغسطس 2026</w:t>
+        <w:t xml:space="preserve">سبتمبر 2026</w:t>
       </w:r>
     </w:p>
     <w:p>
@@ -124,7 +124,7 @@
         <w:t xml:space="preserve"> </w:t>
       </w:r>
       <w:r>
-        <w:t xml:space="preserve">الإصدار الثاني (v1.1) — يتضمن نظام المراجعة والاعتماد</w:t>
+        <w:t xml:space="preserve">الإصدار الثالث (v1.2) — يتضمن نظام المراجعة والاعتماد، إنجازات الشهر، وإعادة تعيين رمز الدخول</w:t>
       </w:r>
     </w:p>
     <w:p>
@@ -1546,19 +1546,19 @@
               <w:jc w:val="left"/>
             </w:pPr>
             <w:r>
-              <w:t xml:space="preserve">عرض تلقائي لشاشات الاستقبال</w:t>
-            </w:r>
-          </w:p>
-        </w:tc>
-        <w:tc>
-          <w:tcPr/>
-          <w:p>
-            <w:pPr>
-              <w:pStyle w:val="Compact"/>
-              <w:jc w:val="left"/>
-            </w:pPr>
-            <w:r>
-              <w:t xml:space="preserve">وضع كشك يعرض الإنجازات والصور بشكل مستمر</w:t>
+              <w:t xml:space="preserve">شاشة كشك للاستقبال</w:t>
+            </w:r>
+          </w:p>
+        </w:tc>
+        <w:tc>
+          <w:tcPr/>
+          <w:p>
+            <w:pPr>
+              <w:pStyle w:val="Compact"/>
+              <w:jc w:val="left"/>
+            </w:pPr>
+            <w:r>
+              <w:t xml:space="preserve">شاشة عرض متاحة للجميع بدون تسجيل دخول: عرض تلقائي (كل 8 ثوانٍ) أو يدوي (السابق/التالي)</w:t>
             </w:r>
           </w:p>
         </w:tc>
@@ -1863,6 +1863,310 @@
             </w:pPr>
             <w:r>
               <w:t xml:space="preserve">منع تجاوز الحدود (4 صور / فيديو واحد / مستند واحد) مع رسائل توضيحية</w:t>
+            </w:r>
+          </w:p>
+        </w:tc>
+      </w:tr>
+      <w:tr>
+        <w:tc>
+          <w:tcPr/>
+          <w:p>
+            <w:pPr>
+              <w:pStyle w:val="Compact"/>
+              <w:jc w:val="left"/>
+            </w:pPr>
+            <w:r>
+              <w:t xml:space="preserve">23</w:t>
+            </w:r>
+          </w:p>
+        </w:tc>
+        <w:tc>
+          <w:tcPr/>
+          <w:p>
+            <w:pPr>
+              <w:pStyle w:val="Compact"/>
+              <w:jc w:val="left"/>
+            </w:pPr>
+            <w:r>
+              <w:t xml:space="preserve">استعادة رمز الدخول</w:t>
+            </w:r>
+          </w:p>
+        </w:tc>
+        <w:tc>
+          <w:tcPr/>
+          <w:p>
+            <w:pPr>
+              <w:pStyle w:val="Compact"/>
+              <w:jc w:val="left"/>
+            </w:pPr>
+            <w:r>
+              <w:t xml:space="preserve">نسيان رمز الإدارة → رابط إعادة تعيين يصلك على البريد المسجل (صالح 15 دقيقة)</w:t>
+            </w:r>
+          </w:p>
+        </w:tc>
+      </w:tr>
+      <w:tr>
+        <w:tc>
+          <w:tcPr/>
+          <w:p>
+            <w:pPr>
+              <w:pStyle w:val="Compact"/>
+              <w:jc w:val="left"/>
+            </w:pPr>
+            <w:r>
+              <w:t xml:space="preserve">24</w:t>
+            </w:r>
+          </w:p>
+        </w:tc>
+        <w:tc>
+          <w:tcPr/>
+          <w:p>
+            <w:pPr>
+              <w:pStyle w:val="Compact"/>
+              <w:jc w:val="left"/>
+            </w:pPr>
+            <w:r>
+              <w:t xml:space="preserve">إنجازات الشهر</w:t>
+            </w:r>
+          </w:p>
+        </w:tc>
+        <w:tc>
+          <w:tcPr/>
+          <w:p>
+            <w:pPr>
+              <w:pStyle w:val="Compact"/>
+              <w:jc w:val="left"/>
+            </w:pPr>
+            <w:r>
+              <w:t xml:space="preserve">منح جوائز شهرية (ذهبي/فضي/برونزي) لأفضل الإنجازات المعتمدة</w:t>
+            </w:r>
+          </w:p>
+        </w:tc>
+      </w:tr>
+      <w:tr>
+        <w:tc>
+          <w:tcPr/>
+          <w:p>
+            <w:pPr>
+              <w:pStyle w:val="Compact"/>
+              <w:jc w:val="left"/>
+            </w:pPr>
+            <w:r>
+              <w:t xml:space="preserve">25</w:t>
+            </w:r>
+          </w:p>
+        </w:tc>
+        <w:tc>
+          <w:tcPr/>
+          <w:p>
+            <w:pPr>
+              <w:pStyle w:val="Compact"/>
+              <w:jc w:val="left"/>
+            </w:pPr>
+            <w:r>
+              <w:t xml:space="preserve">أفضل 10 معلمات شهرياً</w:t>
+            </w:r>
+          </w:p>
+        </w:tc>
+        <w:tc>
+          <w:tcPr/>
+          <w:p>
+            <w:pPr>
+              <w:pStyle w:val="Compact"/>
+              <w:jc w:val="left"/>
+            </w:pPr>
+            <w:r>
+              <w:t xml:space="preserve">قائمة تلقائية بأكثر المعلمات نشاطاً خلال الشهر (الإنجازات المعتمدة فقط)</w:t>
+            </w:r>
+          </w:p>
+        </w:tc>
+      </w:tr>
+      <w:tr>
+        <w:tc>
+          <w:tcPr/>
+          <w:p>
+            <w:pPr>
+              <w:pStyle w:val="Compact"/>
+              <w:jc w:val="left"/>
+            </w:pPr>
+            <w:r>
+              <w:t xml:space="preserve">26</w:t>
+            </w:r>
+          </w:p>
+        </w:tc>
+        <w:tc>
+          <w:tcPr/>
+          <w:p>
+            <w:pPr>
+              <w:pStyle w:val="Compact"/>
+              <w:jc w:val="left"/>
+            </w:pPr>
+            <w:r>
+              <w:t xml:space="preserve">صفحة إنجازات الشهر</w:t>
+            </w:r>
+          </w:p>
+        </w:tc>
+        <w:tc>
+          <w:tcPr/>
+          <w:p>
+            <w:pPr>
+              <w:pStyle w:val="Compact"/>
+              <w:jc w:val="left"/>
+            </w:pPr>
+            <w:r>
+              <w:t xml:space="preserve">عرض الفائزين بجوائز الشهر بتصميم منصة تكريم (كؤوس ذهبية/فضية/برونزية)</w:t>
+            </w:r>
+          </w:p>
+        </w:tc>
+      </w:tr>
+      <w:tr>
+        <w:tc>
+          <w:tcPr/>
+          <w:p>
+            <w:pPr>
+              <w:pStyle w:val="Compact"/>
+              <w:jc w:val="left"/>
+            </w:pPr>
+            <w:r>
+              <w:t xml:space="preserve">27</w:t>
+            </w:r>
+          </w:p>
+        </w:tc>
+        <w:tc>
+          <w:tcPr/>
+          <w:p>
+            <w:pPr>
+              <w:pStyle w:val="Compact"/>
+              <w:jc w:val="left"/>
+            </w:pPr>
+            <w:r>
+              <w:t xml:space="preserve">لوحة تقييم الشهر للإدارة</w:t>
+            </w:r>
+          </w:p>
+        </w:tc>
+        <w:tc>
+          <w:tcPr/>
+          <w:p>
+            <w:pPr>
+              <w:pStyle w:val="Compact"/>
+              <w:jc w:val="left"/>
+            </w:pPr>
+            <w:r>
+              <w:t xml:space="preserve">اختيار الشهر ومنح/إزالة الجوائز من لوحة الإدارة بسهولة</w:t>
+            </w:r>
+          </w:p>
+        </w:tc>
+      </w:tr>
+      <w:tr>
+        <w:tc>
+          <w:tcPr/>
+          <w:p>
+            <w:pPr>
+              <w:pStyle w:val="Compact"/>
+              <w:jc w:val="left"/>
+            </w:pPr>
+            <w:r>
+              <w:t xml:space="preserve">28</w:t>
+            </w:r>
+          </w:p>
+        </w:tc>
+        <w:tc>
+          <w:tcPr/>
+          <w:p>
+            <w:pPr>
+              <w:pStyle w:val="Compact"/>
+              <w:jc w:val="left"/>
+            </w:pPr>
+            <w:r>
+              <w:t xml:space="preserve">وضع يدوي للكشك</w:t>
+            </w:r>
+          </w:p>
+        </w:tc>
+        <w:tc>
+          <w:tcPr/>
+          <w:p>
+            <w:pPr>
+              <w:pStyle w:val="Compact"/>
+              <w:jc w:val="left"/>
+            </w:pPr>
+            <w:r>
+              <w:t xml:space="preserve">التبديل بين العرض التلقائي واليدوي مع إتاحة شاشة الكشك لجميع الزوار</w:t>
+            </w:r>
+          </w:p>
+        </w:tc>
+      </w:tr>
+      <w:tr>
+        <w:tc>
+          <w:tcPr/>
+          <w:p>
+            <w:pPr>
+              <w:pStyle w:val="Compact"/>
+              <w:jc w:val="left"/>
+            </w:pPr>
+            <w:r>
+              <w:t xml:space="preserve">29</w:t>
+            </w:r>
+          </w:p>
+        </w:tc>
+        <w:tc>
+          <w:tcPr/>
+          <w:p>
+            <w:pPr>
+              <w:pStyle w:val="Compact"/>
+              <w:jc w:val="left"/>
+            </w:pPr>
+            <w:r>
+              <w:t xml:space="preserve">إحصاءات دقيقة</w:t>
+            </w:r>
+          </w:p>
+        </w:tc>
+        <w:tc>
+          <w:tcPr/>
+          <w:p>
+            <w:pPr>
+              <w:pStyle w:val="Compact"/>
+              <w:jc w:val="left"/>
+            </w:pPr>
+            <w:r>
+              <w:t xml:space="preserve">جميع التقارير لا تحتسب إلا الإنجازات المعتمدة (المرفوضة لا تُحتسب)</w:t>
+            </w:r>
+          </w:p>
+        </w:tc>
+      </w:tr>
+      <w:tr>
+        <w:tc>
+          <w:tcPr/>
+          <w:p>
+            <w:pPr>
+              <w:pStyle w:val="Compact"/>
+              <w:jc w:val="left"/>
+            </w:pPr>
+            <w:r>
+              <w:t xml:space="preserve">30</w:t>
+            </w:r>
+          </w:p>
+        </w:tc>
+        <w:tc>
+          <w:tcPr/>
+          <w:p>
+            <w:pPr>
+              <w:pStyle w:val="Compact"/>
+              <w:jc w:val="left"/>
+            </w:pPr>
+            <w:r>
+              <w:t xml:space="preserve">تذييل موحد حي</w:t>
+            </w:r>
+          </w:p>
+        </w:tc>
+        <w:tc>
+          <w:tcPr/>
+          <w:p>
+            <w:pPr>
+              <w:pStyle w:val="Compact"/>
+              <w:jc w:val="left"/>
+            </w:pPr>
+            <w:r>
+              <w:t xml:space="preserve">حقوق النشر والسنة الحالية تلقائياً في جميع الصفحات مع تخصيص قسم الحاسب في صفحة الترحيب</w:t>
             </w:r>
           </w:p>
         </w:tc>
@@ -2074,6 +2378,42 @@
           <w:rStyle w:val="VerbatimChar"/>
         </w:rPr>
         <w:t xml:space="preserve">التقارير والطباعة متاحة فوراً</w:t>
+      </w:r>
+      <w:r>
+        <w:br/>
+      </w:r>
+      <w:r>
+        <w:rPr>
+          <w:rStyle w:val="VerbatimChar"/>
+        </w:rPr>
+        <w:t xml:space="preserve">       ↓</w:t>
+      </w:r>
+      <w:r>
+        <w:br/>
+      </w:r>
+      <w:r>
+        <w:rPr>
+          <w:rStyle w:val="VerbatimChar"/>
+        </w:rPr>
+        <w:t xml:space="preserve">الإدارة تختار إنجازات الشهر (ذهبي/فضي/برونزي) من لوحة "تقييم الشهر"</w:t>
+      </w:r>
+      <w:r>
+        <w:br/>
+      </w:r>
+      <w:r>
+        <w:rPr>
+          <w:rStyle w:val="VerbatimChar"/>
+        </w:rPr>
+        <w:t xml:space="preserve">       ↓</w:t>
+      </w:r>
+      <w:r>
+        <w:br/>
+      </w:r>
+      <w:r>
+        <w:rPr>
+          <w:rStyle w:val="VerbatimChar"/>
+        </w:rPr>
+        <w:t xml:space="preserve">تظهر إنجازات الشهر وأفضل 10 معلمات في صفحة "إنجازات الشهر" للجمهور</w:t>
       </w:r>
     </w:p>
     <w:p>
@@ -3034,7 +3374,7 @@
               <w:jc w:val="left"/>
             </w:pPr>
             <w:r>
-              <w:t xml:space="preserve">بناء حديث (Next.js 16) يضمن سرعة تحميل عالية</w:t>
+              <w:t xml:space="preserve">بناء حديث (إطار عمل Next.js) يضمن سرعة تحميل عالية</w:t>
             </w:r>
           </w:p>
         </w:tc>
@@ -3678,6 +4018,44 @@
           </w:p>
         </w:tc>
       </w:tr>
+      <w:tr>
+        <w:tc>
+          <w:tcPr/>
+          <w:p>
+            <w:pPr>
+              <w:pStyle w:val="Compact"/>
+              <w:jc w:val="left"/>
+            </w:pPr>
+            <w:r>
+              <w:t xml:space="preserve">12</w:t>
+            </w:r>
+          </w:p>
+        </w:tc>
+        <w:tc>
+          <w:tcPr/>
+          <w:p>
+            <w:pPr>
+              <w:pStyle w:val="Compact"/>
+              <w:jc w:val="left"/>
+            </w:pPr>
+            <w:r>
+              <w:t xml:space="preserve">استعادة الوصول الآمن</w:t>
+            </w:r>
+          </w:p>
+        </w:tc>
+        <w:tc>
+          <w:tcPr/>
+          <w:p>
+            <w:pPr>
+              <w:pStyle w:val="Compact"/>
+              <w:jc w:val="left"/>
+            </w:pPr>
+            <w:r>
+              <w:t xml:space="preserve">رابط مؤقت (15 دقيقة) لإعادة تعيين رمز الإدارة يُرسل إلى البريد الإلكتروني المسجل في الإعدادات فقط</w:t>
+            </w:r>
+          </w:p>
+        </w:tc>
+      </w:tr>
     </w:tbl>
     <w:p>
       <w:r>
@@ -5145,7 +5523,7 @@
     </w:p>
     <w:bookmarkEnd w:id="60"/>
     <w:bookmarkEnd w:id="61"/>
-    <w:bookmarkStart w:id="66" w:name="ملحق-ب-دليل-مدير-النظام"/>
+    <w:bookmarkStart w:id="67" w:name="ملحق-ب-دليل-مدير-النظام"/>
     <w:p>
       <w:pPr>
         <w:pStyle w:val="Heading2"/>
@@ -5214,6 +5592,42 @@
         <w:t xml:space="preserve">يمكنك تغييره من صفحة الإعدادات &gt; الأمان.</w:t>
       </w:r>
     </w:p>
+    <w:p>
+      <w:pPr>
+        <w:pStyle w:val="BlockText"/>
+      </w:pPr>
+      <w:r>
+        <w:rPr>
+          <w:bCs/>
+          <w:b/>
+        </w:rPr>
+        <w:t xml:space="preserve">نسيتِ الرمز؟</w:t>
+      </w:r>
+      <w:r>
+        <w:t xml:space="preserve"> </w:t>
+      </w:r>
+      <w:r>
+        <w:t xml:space="preserve">اضغطي</w:t>
+      </w:r>
+      <w:r>
+        <w:t xml:space="preserve"> </w:t>
+      </w:r>
+      <w:r>
+        <w:t xml:space="preserve">“</w:t>
+      </w:r>
+      <w:r>
+        <w:t xml:space="preserve">نسيت الرمز؟</w:t>
+      </w:r>
+      <w:r>
+        <w:t xml:space="preserve">”</w:t>
+      </w:r>
+      <w:r>
+        <w:t xml:space="preserve"> </w:t>
+      </w:r>
+      <w:r>
+        <w:t xml:space="preserve">وأدخلي البريد الإلكتروني المسجل في صفحة الإعدادات، وسيصلك رابط لإعادة التعيين صالح لمدة 15 دقيقة، ومنه تنشئين رمزاً جديداً.</w:t>
+      </w:r>
+    </w:p>
     <w:bookmarkEnd w:id="62"/>
     <w:bookmarkStart w:id="63" w:name="إدارة-الإنجازات"/>
     <w:p>
@@ -5321,7 +5735,98 @@
       </w:r>
     </w:p>
     <w:bookmarkEnd w:id="63"/>
-    <w:bookmarkStart w:id="64" w:name="إدارة-الإعدادات"/>
+    <w:bookmarkStart w:id="64" w:name="تقييم-الشهر-وإنجازات-الشهر"/>
+    <w:p>
+      <w:pPr>
+        <w:pStyle w:val="Heading3"/>
+      </w:pPr>
+      <w:r>
+        <w:t xml:space="preserve">تقييم الشهر وإنجازات الشهر</w:t>
+      </w:r>
+    </w:p>
+    <w:p>
+      <w:pPr>
+        <w:numPr>
+          <w:ilvl w:val="0"/>
+          <w:numId w:val="1008"/>
+        </w:numPr>
+        <w:pStyle w:val="Compact"/>
+      </w:pPr>
+      <w:r>
+        <w:t xml:space="preserve">من لوحة الإدارة اضغطي</w:t>
+      </w:r>
+      <w:r>
+        <w:t xml:space="preserve"> </w:t>
+      </w:r>
+      <w:r>
+        <w:t xml:space="preserve">“</w:t>
+      </w:r>
+      <w:r>
+        <w:t xml:space="preserve">تقييم الشهر</w:t>
+      </w:r>
+      <w:r>
+        <w:t xml:space="preserve">”</w:t>
+      </w:r>
+      <w:r>
+        <w:t xml:space="preserve">.</w:t>
+      </w:r>
+    </w:p>
+    <w:p>
+      <w:pPr>
+        <w:numPr>
+          <w:ilvl w:val="0"/>
+          <w:numId w:val="1008"/>
+        </w:numPr>
+        <w:pStyle w:val="Compact"/>
+      </w:pPr>
+      <w:r>
+        <w:t xml:space="preserve">اختاري الشهر المطلوب، وستظهر الإنجازات المعتمدة في هذا الشهر.</w:t>
+      </w:r>
+    </w:p>
+    <w:p>
+      <w:pPr>
+        <w:numPr>
+          <w:ilvl w:val="0"/>
+          <w:numId w:val="1008"/>
+        </w:numPr>
+        <w:pStyle w:val="Compact"/>
+      </w:pPr>
+      <w:r>
+        <w:t xml:space="preserve">امنحي أي إنجاز جائزة ذهبية أو فضية أو برونزية، أو أزيليها في أي وقت.</w:t>
+      </w:r>
+    </w:p>
+    <w:p>
+      <w:pPr>
+        <w:numPr>
+          <w:ilvl w:val="0"/>
+          <w:numId w:val="1008"/>
+        </w:numPr>
+        <w:pStyle w:val="Compact"/>
+      </w:pPr>
+      <w:r>
+        <w:t xml:space="preserve">تظهر النتائج تلقائياً للجمهور في صفحة</w:t>
+      </w:r>
+      <w:r>
+        <w:t xml:space="preserve"> </w:t>
+      </w:r>
+      <w:r>
+        <w:t xml:space="preserve">“</w:t>
+      </w:r>
+      <w:r>
+        <w:t xml:space="preserve">إنجازات الشهر</w:t>
+      </w:r>
+      <w:r>
+        <w:t xml:space="preserve">”</w:t>
+      </w:r>
+      <w:r>
+        <w:t xml:space="preserve"> </w:t>
+      </w:r>
+      <w:r>
+        <w:t xml:space="preserve">مع قائمة أفضل 10 معلمات (تُحسب الإنجازات المعتمدة فقط).</w:t>
+      </w:r>
+    </w:p>
+    <w:bookmarkEnd w:id="64"/>
+    <w:bookmarkStart w:id="65" w:name="إدارة-الإعدادات"/>
     <w:p>
       <w:pPr>
         <w:pStyle w:val="Heading3"/>
@@ -5399,7 +5904,25 @@
         <w:t xml:space="preserve"> </w:t>
       </w:r>
       <w:r>
-        <w:t xml:space="preserve">تغيير رمز PIN للإدارة.</w:t>
+        <w:t xml:space="preserve">تغيير رمز PIN للإدارة، وتعيين البريد الإلكتروني الذي يستقبل رابط إعادة التعيين عند نسيان الرمز.</w:t>
+      </w:r>
+    </w:p>
+    <w:p>
+      <w:pPr>
+        <w:pStyle w:val="BodyText"/>
+      </w:pPr>
+      <w:r>
+        <w:rPr>
+          <w:bCs/>
+          <w:b/>
+        </w:rPr>
+        <w:t xml:space="preserve">قسم الحاسب:</w:t>
+      </w:r>
+      <w:r>
+        <w:t xml:space="preserve"> </w:t>
+      </w:r>
+      <w:r>
+        <w:t xml:space="preserve">اسم معلمة قسم الحاسب ورئيسة القسم (تظهر في صفحة الترحيب والتذييل الموحد).</w:t>
       </w:r>
     </w:p>
     <w:p>
@@ -5420,8 +5943,8 @@
         <w:t xml:space="preserve">فحص التخزين السحابي واكتشاف وحذف الملفات المعطلة أو المعزولة.</w:t>
       </w:r>
     </w:p>
-    <w:bookmarkEnd w:id="64"/>
-    <w:bookmarkStart w:id="65" w:name="إنشاء-تقارير"/>
+    <w:bookmarkEnd w:id="65"/>
+    <w:bookmarkStart w:id="66" w:name="إنشاء-تقارير"/>
     <w:p>
       <w:pPr>
         <w:pStyle w:val="Heading3"/>
@@ -5434,7 +5957,7 @@
       <w:pPr>
         <w:numPr>
           <w:ilvl w:val="0"/>
-          <w:numId w:val="1008"/>
+          <w:numId w:val="1009"/>
         </w:numPr>
         <w:pStyle w:val="Compact"/>
       </w:pPr>
@@ -5461,7 +5984,7 @@
       <w:pPr>
         <w:numPr>
           <w:ilvl w:val="0"/>
-          <w:numId w:val="1008"/>
+          <w:numId w:val="1009"/>
         </w:numPr>
         <w:pStyle w:val="Compact"/>
       </w:pPr>
@@ -5509,7 +6032,7 @@
       <w:pPr>
         <w:numPr>
           <w:ilvl w:val="0"/>
-          <w:numId w:val="1008"/>
+          <w:numId w:val="1009"/>
         </w:numPr>
         <w:pStyle w:val="Compact"/>
       </w:pPr>
@@ -5542,9 +6065,9 @@
         </w:pict>
       </w:r>
     </w:p>
-    <w:bookmarkEnd w:id="65"/>
     <w:bookmarkEnd w:id="66"/>
-    <w:bookmarkStart w:id="67" w:name="ملحق-ج-ملخص-تنفيذي-من-صفحة-واحدة"/>
+    <w:bookmarkEnd w:id="67"/>
+    <w:bookmarkStart w:id="68" w:name="ملحق-ج-ملخص-تنفيذي-من-صفحة-واحدة"/>
     <w:p>
       <w:pPr>
         <w:pStyle w:val="Heading2"/>
@@ -5840,8 +6363,8 @@
         <w:t xml:space="preserve">أُعدّ هذا الملف لتقديم المشروع إلى إدارة المدرسة. جميع المعلومات مستمدة من النظام الفعلي.</w:t>
       </w:r>
     </w:p>
-    <w:bookmarkEnd w:id="67"/>
     <w:bookmarkEnd w:id="68"/>
+    <w:bookmarkEnd w:id="69"/>
     <w:sectPr/>
   </w:body>
 </w:document>
@@ -6269,6 +6792,9 @@
     <w:abstractNumId w:val="991"/>
   </w:num>
   <w:num w:numId="1008">
+    <w:abstractNumId w:val="991"/>
+  </w:num>
+  <w:num w:numId="1009">
     <w:abstractNumId w:val="99411"/>
     <w:lvlOverride w:ilvl="0">
       <w:startOverride w:val="1"/>
@@ -6309,7 +6835,7 @@
         <w:rFonts w:asciiTheme="minorHAnsi" w:cstheme="minorBidi" w:eastAsiaTheme="minorHAnsi" w:hAnsiTheme="minorHAnsi"/>
         <w:sz w:val="24"/>
         <w:szCs w:val="24"/>
-        <w:lang w:bidi="ar" w:eastAsia="en-US" w:val="en-US"/>
+        <w:lang w:bidi="ar-SA" w:eastAsia="en-US" w:val="en-US"/>
       </w:rPr>
     </w:rPrDefault>
     <w:pPrDefault>
@@ -6787,7 +7313,7 @@
       <w:color w:themeColor="accent1" w:themeShade="BF" w:val="365F91"/>
     </w:rPr>
   </w:style>
-  <w:style w:customStyle="1" w:styleId="SourceCode" w:type="paragraph">
+  <w:style w:type="paragraph" w:customStyle="1" w:styleId="SourceCode">
     <w:name w:val="Source Code"/>
     <w:basedOn w:val="Normal"/>
     <w:link w:val="VerbatimChar"/>
@@ -6795,7 +7321,7 @@
       <w:wordWrap w:val="off"/>
     </w:pPr>
   </w:style>
-  <w:style w:customStyle="1" w:styleId="KeywordTok" w:type="character">
+  <w:style w:type="character" w:customStyle="1" w:styleId="KeywordTok">
     <w:name w:val="KeywordTok"/>
     <w:basedOn w:val="VerbatimChar"/>
     <w:rPr>
@@ -6803,77 +7329,77 @@
       <w:b/>
     </w:rPr>
   </w:style>
-  <w:style w:customStyle="1" w:styleId="DataTypeTok" w:type="character">
+  <w:style w:type="character" w:customStyle="1" w:styleId="DataTypeTok">
     <w:name w:val="DataTypeTok"/>
     <w:basedOn w:val="VerbatimChar"/>
     <w:rPr>
       <w:color w:val="902000"/>
     </w:rPr>
   </w:style>
-  <w:style w:customStyle="1" w:styleId="DecValTok" w:type="character">
+  <w:style w:type="character" w:customStyle="1" w:styleId="DecValTok">
     <w:name w:val="DecValTok"/>
     <w:basedOn w:val="VerbatimChar"/>
     <w:rPr>
       <w:color w:val="40a070"/>
     </w:rPr>
   </w:style>
-  <w:style w:customStyle="1" w:styleId="BaseNTok" w:type="character">
+  <w:style w:type="character" w:customStyle="1" w:styleId="BaseNTok">
     <w:name w:val="BaseNTok"/>
     <w:basedOn w:val="VerbatimChar"/>
     <w:rPr>
       <w:color w:val="40a070"/>
     </w:rPr>
   </w:style>
-  <w:style w:customStyle="1" w:styleId="FloatTok" w:type="character">
+  <w:style w:type="character" w:customStyle="1" w:styleId="FloatTok">
     <w:name w:val="FloatTok"/>
     <w:basedOn w:val="VerbatimChar"/>
     <w:rPr>
       <w:color w:val="40a070"/>
     </w:rPr>
   </w:style>
-  <w:style w:customStyle="1" w:styleId="ConstantTok" w:type="character">
+  <w:style w:type="character" w:customStyle="1" w:styleId="ConstantTok">
     <w:name w:val="ConstantTok"/>
     <w:basedOn w:val="VerbatimChar"/>
     <w:rPr>
       <w:color w:val="880000"/>
     </w:rPr>
   </w:style>
-  <w:style w:customStyle="1" w:styleId="CharTok" w:type="character">
+  <w:style w:type="character" w:customStyle="1" w:styleId="CharTok">
     <w:name w:val="CharTok"/>
     <w:basedOn w:val="VerbatimChar"/>
     <w:rPr>
       <w:color w:val="4070a0"/>
     </w:rPr>
   </w:style>
-  <w:style w:customStyle="1" w:styleId="SpecialCharTok" w:type="character">
+  <w:style w:type="character" w:customStyle="1" w:styleId="SpecialCharTok">
     <w:name w:val="SpecialCharTok"/>
     <w:basedOn w:val="VerbatimChar"/>
     <w:rPr>
       <w:color w:val="4070a0"/>
     </w:rPr>
   </w:style>
-  <w:style w:customStyle="1" w:styleId="StringTok" w:type="character">
+  <w:style w:type="character" w:customStyle="1" w:styleId="StringTok">
     <w:name w:val="StringTok"/>
     <w:basedOn w:val="VerbatimChar"/>
     <w:rPr>
       <w:color w:val="4070a0"/>
     </w:rPr>
   </w:style>
-  <w:style w:customStyle="1" w:styleId="VerbatimStringTok" w:type="character">
+  <w:style w:type="character" w:customStyle="1" w:styleId="VerbatimStringTok">
     <w:name w:val="VerbatimStringTok"/>
     <w:basedOn w:val="VerbatimChar"/>
     <w:rPr>
       <w:color w:val="4070a0"/>
     </w:rPr>
   </w:style>
-  <w:style w:customStyle="1" w:styleId="SpecialStringTok" w:type="character">
+  <w:style w:type="character" w:customStyle="1" w:styleId="SpecialStringTok">
     <w:name w:val="SpecialStringTok"/>
     <w:basedOn w:val="VerbatimChar"/>
     <w:rPr>
       <w:color w:val="bb6688"/>
     </w:rPr>
   </w:style>
-  <w:style w:customStyle="1" w:styleId="ImportTok" w:type="character">
+  <w:style w:type="character" w:customStyle="1" w:styleId="ImportTok">
     <w:name w:val="ImportTok"/>
     <w:basedOn w:val="VerbatimChar"/>
     <w:rPr>
@@ -6881,7 +7407,7 @@
       <w:b/>
     </w:rPr>
   </w:style>
-  <w:style w:customStyle="1" w:styleId="CommentTok" w:type="character">
+  <w:style w:type="character" w:customStyle="1" w:styleId="CommentTok">
     <w:name w:val="CommentTok"/>
     <w:basedOn w:val="VerbatimChar"/>
     <w:rPr>
@@ -6889,7 +7415,7 @@
       <w:i/>
     </w:rPr>
   </w:style>
-  <w:style w:customStyle="1" w:styleId="DocumentationTok" w:type="character">
+  <w:style w:type="character" w:customStyle="1" w:styleId="DocumentationTok">
     <w:name w:val="DocumentationTok"/>
     <w:basedOn w:val="VerbatimChar"/>
     <w:rPr>
@@ -6897,7 +7423,7 @@
       <w:i/>
     </w:rPr>
   </w:style>
-  <w:style w:customStyle="1" w:styleId="AnnotationTok" w:type="character">
+  <w:style w:type="character" w:customStyle="1" w:styleId="AnnotationTok">
     <w:name w:val="AnnotationTok"/>
     <w:basedOn w:val="VerbatimChar"/>
     <w:rPr>
@@ -6906,7 +7432,7 @@
       <w:i/>
     </w:rPr>
   </w:style>
-  <w:style w:customStyle="1" w:styleId="CommentVarTok" w:type="character">
+  <w:style w:type="character" w:customStyle="1" w:styleId="CommentVarTok">
     <w:name w:val="CommentVarTok"/>
     <w:basedOn w:val="VerbatimChar"/>
     <w:rPr>
@@ -6915,28 +7441,28 @@
       <w:i/>
     </w:rPr>
   </w:style>
-  <w:style w:customStyle="1" w:styleId="OtherTok" w:type="character">
+  <w:style w:type="character" w:customStyle="1" w:styleId="OtherTok">
     <w:name w:val="OtherTok"/>
     <w:basedOn w:val="VerbatimChar"/>
     <w:rPr>
       <w:color w:val="007020"/>
     </w:rPr>
   </w:style>
-  <w:style w:customStyle="1" w:styleId="FunctionTok" w:type="character">
+  <w:style w:type="character" w:customStyle="1" w:styleId="FunctionTok">
     <w:name w:val="FunctionTok"/>
     <w:basedOn w:val="VerbatimChar"/>
     <w:rPr>
       <w:color w:val="06287e"/>
     </w:rPr>
   </w:style>
-  <w:style w:customStyle="1" w:styleId="VariableTok" w:type="character">
+  <w:style w:type="character" w:customStyle="1" w:styleId="VariableTok">
     <w:name w:val="VariableTok"/>
     <w:basedOn w:val="VerbatimChar"/>
     <w:rPr>
       <w:color w:val="19177c"/>
     </w:rPr>
   </w:style>
-  <w:style w:customStyle="1" w:styleId="ControlFlowTok" w:type="character">
+  <w:style w:type="character" w:customStyle="1" w:styleId="ControlFlowTok">
     <w:name w:val="ControlFlowTok"/>
     <w:basedOn w:val="VerbatimChar"/>
     <w:rPr>
@@ -6944,45 +7470,45 @@
       <w:b/>
     </w:rPr>
   </w:style>
-  <w:style w:customStyle="1" w:styleId="OperatorTok" w:type="character">
+  <w:style w:type="character" w:customStyle="1" w:styleId="OperatorTok">
     <w:name w:val="OperatorTok"/>
     <w:basedOn w:val="VerbatimChar"/>
     <w:rPr>
       <w:color w:val="666666"/>
     </w:rPr>
   </w:style>
-  <w:style w:customStyle="1" w:styleId="BuiltInTok" w:type="character">
+  <w:style w:type="character" w:customStyle="1" w:styleId="BuiltInTok">
     <w:name w:val="BuiltInTok"/>
     <w:basedOn w:val="VerbatimChar"/>
     <w:rPr>
       <w:color w:val="008000"/>
     </w:rPr>
   </w:style>
-  <w:style w:customStyle="1" w:styleId="ExtensionTok" w:type="character">
+  <w:style w:type="character" w:customStyle="1" w:styleId="ExtensionTok">
     <w:name w:val="ExtensionTok"/>
     <w:basedOn w:val="VerbatimChar"/>
     <w:rPr/>
   </w:style>
-  <w:style w:customStyle="1" w:styleId="PreprocessorTok" w:type="character">
+  <w:style w:type="character" w:customStyle="1" w:styleId="PreprocessorTok">
     <w:name w:val="PreprocessorTok"/>
     <w:basedOn w:val="VerbatimChar"/>
     <w:rPr>
       <w:color w:val="bc7a00"/>
     </w:rPr>
   </w:style>
-  <w:style w:customStyle="1" w:styleId="AttributeTok" w:type="character">
+  <w:style w:type="character" w:customStyle="1" w:styleId="AttributeTok">
     <w:name w:val="AttributeTok"/>
     <w:basedOn w:val="VerbatimChar"/>
     <w:rPr>
       <w:color w:val="7d9029"/>
     </w:rPr>
   </w:style>
-  <w:style w:customStyle="1" w:styleId="RegionMarkerTok" w:type="character">
+  <w:style w:type="character" w:customStyle="1" w:styleId="RegionMarkerTok">
     <w:name w:val="RegionMarkerTok"/>
     <w:basedOn w:val="VerbatimChar"/>
     <w:rPr/>
   </w:style>
-  <w:style w:customStyle="1" w:styleId="InformationTok" w:type="character">
+  <w:style w:type="character" w:customStyle="1" w:styleId="InformationTok">
     <w:name w:val="InformationTok"/>
     <w:basedOn w:val="VerbatimChar"/>
     <w:rPr>
@@ -6991,7 +7517,7 @@
       <w:i/>
     </w:rPr>
   </w:style>
-  <w:style w:customStyle="1" w:styleId="WarningTok" w:type="character">
+  <w:style w:type="character" w:customStyle="1" w:styleId="WarningTok">
     <w:name w:val="WarningTok"/>
     <w:basedOn w:val="VerbatimChar"/>
     <w:rPr>
@@ -7000,7 +7526,7 @@
       <w:i/>
     </w:rPr>
   </w:style>
-  <w:style w:customStyle="1" w:styleId="AlertTok" w:type="character">
+  <w:style w:type="character" w:customStyle="1" w:styleId="AlertTok">
     <w:name w:val="AlertTok"/>
     <w:basedOn w:val="VerbatimChar"/>
     <w:rPr>
@@ -7008,7 +7534,7 @@
       <w:b/>
     </w:rPr>
   </w:style>
-  <w:style w:customStyle="1" w:styleId="ErrorTok" w:type="character">
+  <w:style w:type="character" w:customStyle="1" w:styleId="ErrorTok">
     <w:name w:val="ErrorTok"/>
     <w:basedOn w:val="VerbatimChar"/>
     <w:rPr>
@@ -7016,7 +7542,7 @@
       <w:b/>
     </w:rPr>
   </w:style>
-  <w:style w:customStyle="1" w:styleId="NormalTok" w:type="character">
+  <w:style w:type="character" w:customStyle="1" w:styleId="NormalTok">
     <w:name w:val="NormalTok"/>
     <w:basedOn w:val="VerbatimChar"/>
     <w:rPr/>

</xml_diff>